<commit_message>
Note on occupancy method: add the web app method switch section
Co-Authored-By: Claude Opus 5.5 <noreply@anthropic.com>
Claude-Session: https://claude.ai/code/session_01P4kE26CUyRdJH4j7AYmNZW
</commit_message>
<xml_diff>
--- a/Final Presentation/OCT'26/Note on occupancy method 15102026.docx
+++ b/Final Presentation/OCT'26/Note on occupancy method 15102026.docx
@@ -1191,6 +1191,132 @@
         <w:t>the average stay falls from 1.8 to 1.1 hours. Nalbandyan's off-street facility falls from 142% to 92%. Turnover is unchanged, because it counts parking events, not hours.</w:t>
       </w:r>
     </w:p>
+    <w:p>
+      <w:pPr>
+        <w:ind w:left="360" w:hanging="360"/>
+      </w:pPr>
+    </w:p>
+    <w:p>
+      <w:pPr>
+        <w:ind w:left="360" w:hanging="360"/>
+      </w:pPr>
+    </w:p>
+    <w:p>
+      <w:pPr>
+        <w:ind w:left="360" w:hanging="360"/>
+      </w:pPr>
+    </w:p>
+    <w:p>
+      <w:pPr>
+        <w:ind w:left="360" w:hanging="360"/>
+      </w:pPr>
+    </w:p>
+    <w:p>
+      <w:pPr>
+        <w:ind w:left="360" w:hanging="360"/>
+      </w:pPr>
+    </w:p>
+    <w:p>
+      <w:pPr>
+        <w:ind w:left="360" w:hanging="360"/>
+      </w:pPr>
+    </w:p>
+    <w:p>
+      <w:pPr>
+        <w:ind w:left="360" w:hanging="360"/>
+      </w:pPr>
+    </w:p>
+    <w:p>
+      <w:pPr>
+        <w:spacing w:before="120" w:after="60"/>
+      </w:pPr>
+      <w:r>
+        <w:rPr>
+          <w:b/>
+          <w:color w:val="1F3A5F"/>
+          <w:sz w:val="23"/>
+        </w:rPr>
+        <w:t>Both methods in the web app</w:t>
+      </w:r>
+    </w:p>
+    <w:p>
+      <w:r>
+        <w:t>The web app (</w:t>
+      </w:r>
+      <w:hyperlink r:id="rId6" w:history="1">
+        <w:r>
+          <w:rPr>
+            <w:rStyle w:val="Hyperlink"/>
+          </w:rPr>
+          <w:t>yerevan-parking.v</w:t>
+        </w:r>
+        <w:r>
+          <w:rPr>
+            <w:rStyle w:val="Hyperlink"/>
+          </w:rPr>
+          <w:t>e</w:t>
+        </w:r>
+        <w:r>
+          <w:rPr>
+            <w:rStyle w:val="Hyperlink"/>
+          </w:rPr>
+          <w:t>rcel.app</w:t>
+        </w:r>
+      </w:hyperlink>
+      <w:r>
+        <w:t>) now shows both methods. On the Field Surveys step, the Occupancy method switch, circled below, recolours the zone map and recalculates every dashboard figure and zone pop-up between the half-hour method and the old, measured basis.</w:t>
+      </w:r>
+    </w:p>
+    <w:p>
+      <w:pPr>
+        <w:ind w:left="360" w:hanging="360"/>
+      </w:pPr>
+    </w:p>
+    <w:p>
+      <w:pPr>
+        <w:jc w:val="center"/>
+      </w:pPr>
+      <w:r>
+        <w:rPr>
+          <w:noProof/>
+        </w:rPr>
+        <w:drawing>
+          <wp:inline distT="0" distB="0" distL="0" distR="0" wp14:anchorId="47EA51AC" wp14:editId="034C0589">
+            <wp:extent cx="2314898" cy="3505689"/>
+            <wp:effectExtent l="0" t="0" r="9525" b="0"/>
+            <wp:docPr id="50829646" name="Picture 1"/>
+            <wp:cNvGraphicFramePr>
+              <a:graphicFrameLocks xmlns:a="http://schemas.openxmlformats.org/drawingml/2006/main" noChangeAspect="1"/>
+            </wp:cNvGraphicFramePr>
+            <a:graphic xmlns:a="http://schemas.openxmlformats.org/drawingml/2006/main">
+              <a:graphicData uri="http://schemas.openxmlformats.org/drawingml/2006/picture">
+                <pic:pic xmlns:pic="http://schemas.openxmlformats.org/drawingml/2006/picture">
+                  <pic:nvPicPr>
+                    <pic:cNvPr id="50829646" name=""/>
+                    <pic:cNvPicPr/>
+                  </pic:nvPicPr>
+                  <pic:blipFill>
+                    <a:blip r:embed="rId7"/>
+                    <a:stretch>
+                      <a:fillRect/>
+                    </a:stretch>
+                  </pic:blipFill>
+                  <pic:spPr>
+                    <a:xfrm>
+                      <a:off x="0" y="0"/>
+                      <a:ext cx="2314898" cy="3505689"/>
+                    </a:xfrm>
+                    <a:prstGeom prst="rect">
+                      <a:avLst/>
+                    </a:prstGeom>
+                  </pic:spPr>
+                </pic:pic>
+              </a:graphicData>
+            </a:graphic>
+          </wp:inline>
+        </w:drawing>
+      </w:r>
+    </w:p>
     <w:sectPr>
       <w:pgSz w:w="11906" w:h="16838"/>
       <w:pgMar w:top="737" w:right="1020" w:bottom="737" w:left="1020" w:header="720" w:footer="720" w:gutter="0"/>
@@ -12793,6 +12919,41 @@
       </w:tcPr>
     </w:tblStylePr>
   </w:style>
+  <w:style w:type="character" w:styleId="Hyperlink">
+    <w:name w:val="Hyperlink"/>
+    <w:basedOn w:val="DefaultParagraphFont"/>
+    <w:uiPriority w:val="99"/>
+    <w:unhideWhenUsed/>
+    <w:rsid w:val="000B44BF"/>
+    <w:rPr>
+      <w:color w:val="0000FF" w:themeColor="hyperlink"/>
+      <w:u w:val="single"/>
+    </w:rPr>
+  </w:style>
+  <w:style w:type="character" w:styleId="UnresolvedMention">
+    <w:name w:val="Unresolved Mention"/>
+    <w:basedOn w:val="DefaultParagraphFont"/>
+    <w:uiPriority w:val="99"/>
+    <w:semiHidden/>
+    <w:unhideWhenUsed/>
+    <w:rsid w:val="000B44BF"/>
+    <w:rPr>
+      <w:color w:val="605E5C"/>
+      <w:shd w:val="clear" w:color="auto" w:fill="E1DFDD"/>
+    </w:rPr>
+  </w:style>
+  <w:style w:type="character" w:styleId="FollowedHyperlink">
+    <w:name w:val="FollowedHyperlink"/>
+    <w:basedOn w:val="DefaultParagraphFont"/>
+    <w:uiPriority w:val="99"/>
+    <w:semiHidden/>
+    <w:unhideWhenUsed/>
+    <w:rsid w:val="000B44BF"/>
+    <w:rPr>
+      <w:color w:val="800080" w:themeColor="followedHyperlink"/>
+      <w:u w:val="single"/>
+    </w:rPr>
+  </w:style>
 </w:styles>
 </file>
 

</xml_diff>